<commit_message>
Your current version of Antigravity is out of date. Please visit https://antigravity.google/download to download and install the latest version.
</commit_message>
<xml_diff>
--- a/public/generated-docs/NT.00016.EQTL-03-ANEXO-III-NT.016.EQTL-Termo-de-Solicitacao-de-Compartilhamento.docx
+++ b/public/generated-docs/NT.00016.EQTL-03-ANEXO-III-NT.016.EQTL-Termo-de-Solicitacao-de-Compartilhamento.docx
@@ -17,7 +17,7 @@
           <w:color w:val="000000"/>
           <w:spacing w:val="-2"/>
         </w:rPr>
-        <w:t xml:space="preserve">Matões</w:t>
+        <w:t xml:space="preserve">Belém</w:t>
       </w:r>
       <w:r>
         <w:rPr>
@@ -33,7 +33,7 @@
           <w:color w:val="000000"/>
           <w:spacing w:val="-2"/>
         </w:rPr>
-        <w:t xml:space="preserve">Maranhão</w:t>
+        <w:t xml:space="preserve">Pará</w:t>
       </w:r>
       <w:r>
         <w:rPr>
@@ -49,7 +49,7 @@
           <w:color w:val="000000"/>
           <w:spacing w:val="-2"/>
         </w:rPr>
-        <w:t xml:space="preserve">4 de fevereiro de 2026</w:t>
+        <w:t xml:space="preserve">23 de fevereiro de 2026</w:t>
       </w:r>
       <w:r>
         <w:rPr>
@@ -107,7 +107,7 @@
           <w:color w:val="000000"/>
           <w:spacing w:val="-2"/>
         </w:rPr>
-        <w:t xml:space="preserve">EQUATORIAL MARANHÃO</w:t>
+        <w:t xml:space="preserve">EQUATORIAL PARÁ</w:t>
       </w:r>
     </w:p>
     <w:p>
@@ -251,7 +251,7 @@
         <w:rPr>
           <w:rFonts w:ascii="Times New Roman" w:hAnsi="Times New Roman" w:cs="Times New Roman"/>
         </w:rPr>
-        <w:t xml:space="preserve">SNI NET TELECOM</w:t>
+        <w:t xml:space="preserve">NOVA NET SA</w:t>
       </w:r>
       <w:r>
         <w:rPr>
@@ -263,7 +263,7 @@
         <w:rPr>
           <w:rFonts w:ascii="Times New Roman" w:hAnsi="Times New Roman" w:cs="Times New Roman"/>
         </w:rPr>
-        <w:t xml:space="preserve">C. O. DOS SANTOS SOUSA</w:t>
+        <w:t xml:space="preserve">NOVA NET SA SERVICOS DE TELECOMUNICACOES LTDA</w:t>
       </w:r>
       <w:r>
         <w:rPr>
@@ -296,7 +296,7 @@
           <w:rFonts w:ascii="Times New Roman" w:hAnsi="Times New Roman" w:cs="Times New Roman"/>
           <w:color w:val="000000"/>
         </w:rPr>
-        <w:t xml:space="preserve">06.323.714/0001-17</w:t>
+        <w:t xml:space="preserve">51.901.921/0001-66</w:t>
       </w:r>
       <w:r>
         <w:rPr>
@@ -310,7 +310,7 @@
           <w:rFonts w:ascii="Times New Roman" w:hAnsi="Times New Roman" w:cs="Times New Roman"/>
           <w:color w:val="000000"/>
         </w:rPr>
-        <w:t xml:space="preserve">R Timon, 355, Centro, Parnarama/MA, CEP: 65.640-000</w:t>
+        <w:t xml:space="preserve">Tv. Rui Barbosa 525, Reduto, Belém/PA, CEP: 68.509-650</w:t>
       </w:r>
       <w:r>
         <w:rPr>
@@ -911,7 +911,7 @@
           <w:rFonts w:ascii="Times New Roman" w:hAnsi="Times New Roman" w:cs="Times New Roman"/>
           <w:color w:val="000000"/>
         </w:rPr>
-        <w:t xml:space="preserve">Carlos Odeon dos Santos Sousa</w:t>
+        <w:t xml:space="preserve">SALOMAO DOS SANTOS MATOS</w:t>
       </w:r>
     </w:p>
     <w:p>
@@ -929,7 +929,7 @@
           <w:rFonts w:ascii="Times New Roman" w:hAnsi="Times New Roman" w:cs="Times New Roman"/>
           <w:color w:val="000000"/>
         </w:rPr>
-        <w:t xml:space="preserve">Sócio/Propriétario</w:t>
+        <w:t xml:space="preserve">Sócio/Administrador</w:t>
       </w:r>
     </w:p>
     <w:p>
@@ -946,7 +946,7 @@
         <w:rPr>
           <w:rFonts w:ascii="Times New Roman" w:hAnsi="Times New Roman" w:cs="Times New Roman"/>
         </w:rPr>
-        <w:t xml:space="preserve">CARLOS16SNI@HOTMAIL.COM</w:t>
+        <w:t xml:space="preserve">smmattos1004@gmail.com</w:t>
       </w:r>
       <w:r>
         <w:rPr>
@@ -960,7 +960,7 @@
           <w:rFonts w:ascii="Times New Roman" w:hAnsi="Times New Roman" w:cs="Times New Roman"/>
           <w:color w:val="000000"/>
         </w:rPr>
-        <w:t xml:space="preserve">(99) 8430-1702</w:t>
+        <w:t xml:space="preserve">(91) 9257-9462</w:t>
       </w:r>
     </w:p>
     <w:p>

</xml_diff>